<commit_message>
Practică: fișe, pornire, rezolvări și modele E13–E34
</commit_message>
<xml_diff>
--- a/fise/E13_Sedinta_PORNIRE.docx
+++ b/fise/E13_Sedinta_PORNIRE.docx
@@ -80,11 +80,12 @@
       <w:tblPr>
         <w:tblStyle w:val="TableGrid"/>
         <w:tblW w:type="auto" w:w="0"/>
+        <w:tblLayout w:type="fixed"/>
         <w:tblLook w:firstColumn="1" w:firstRow="1" w:lastColumn="0" w:lastRow="0" w:noHBand="0" w:noVBand="1" w:val="04A0"/>
       </w:tblPr>
       <w:tblGrid>
-        <w:gridCol w:w="4819"/>
-        <w:gridCol w:w="4819"/>
+        <w:gridCol w:w="3118"/>
+        <w:gridCol w:w="6520"/>
       </w:tblGrid>
       <w:tr>
         <w:tc>
@@ -430,11 +431,12 @@
       <w:tblPr>
         <w:tblStyle w:val="TableGrid"/>
         <w:tblW w:type="auto" w:w="0"/>
+        <w:tblLayout w:type="fixed"/>
         <w:tblLook w:firstColumn="1" w:firstRow="1" w:lastColumn="0" w:lastRow="0" w:noHBand="0" w:noVBand="1" w:val="04A0"/>
       </w:tblPr>
       <w:tblGrid>
-        <w:gridCol w:w="4819"/>
-        <w:gridCol w:w="4819"/>
+        <w:gridCol w:w="850"/>
+        <w:gridCol w:w="8788"/>
       </w:tblGrid>
       <w:tr>
         <w:tc>
@@ -564,12 +566,13 @@
       <w:tblPr>
         <w:tblStyle w:val="TableGrid"/>
         <w:tblW w:type="auto" w:w="0"/>
+        <w:tblLayout w:type="fixed"/>
         <w:tblLook w:firstColumn="1" w:firstRow="1" w:lastColumn="0" w:lastRow="0" w:noHBand="0" w:noVBand="1" w:val="04A0"/>
       </w:tblPr>
       <w:tblGrid>
-        <w:gridCol w:w="3213"/>
-        <w:gridCol w:w="3213"/>
-        <w:gridCol w:w="3213"/>
+        <w:gridCol w:w="2268"/>
+        <w:gridCol w:w="5103"/>
+        <w:gridCol w:w="2268"/>
       </w:tblGrid>
       <w:tr>
         <w:tc>

</xml_diff>